<commit_message>
P10: data dari jaringan tampil di halaman
</commit_message>
<xml_diff>
--- a/Worksheet_P9/9. Worksheet_PABW_Pertemuan9 - ID.docx
+++ b/Worksheet_P9/9. Worksheet_PABW_Pertemuan9 - ID.docx
@@ -9356,6 +9356,9 @@
             <w:pPr>
               <w:spacing w:before="20" w:after="20" w:line="252" w:lineRule="auto"/>
             </w:pPr>
+            <w:r>
+              <w:t>Halaman tidak memuat ulang. Muncul 4 pesan merah di bawah masing-masing kolom (nama, email, NIM, pesan), kursor pindah ke kolom Nama, dan tombol Kirim menjadi tidak aktif.</w:t>
+            </w:r>
           </w:p>
         </w:tc>
       </w:tr>
@@ -9425,6 +9428,15 @@
             <w:pPr>
               <w:spacing w:before="20" w:after="20" w:line="252" w:lineRule="auto"/>
             </w:pPr>
+            <w:r>
+              <w:t>Setelah saya ketik "</w:t>
+            </w:r>
+            <w:r>
+              <w:t>andi</w:t>
+            </w:r>
+            <w:r>
+              <w:t>" di kolom Nama, pesan galat Nama langsung hilang, sedangkan tiga pesan lain tetap ada.</w:t>
+            </w:r>
           </w:p>
         </w:tc>
       </w:tr>
@@ -9494,6 +9506,9 @@
             <w:pPr>
               <w:spacing w:before="20" w:after="20" w:line="252" w:lineRule="auto"/>
             </w:pPr>
+            <w:r>
+              <w:t>Kolom Nama yang saya isi spasi saja tetap menampilkan "Isi nama lengkap Anda.", karena isinya dipangkas dengan trim() sehingga dianggap kosong.</w:t>
+            </w:r>
           </w:p>
         </w:tc>
       </w:tr>
@@ -9563,6 +9578,9 @@
             <w:pPr>
               <w:spacing w:before="20" w:after="20" w:line="252" w:lineRule="auto"/>
             </w:pPr>
+            <w:r>
+              <w:t>Tombol Kirim tetap tidak aktif selama masih ada kolom yang bermasalah. Setelah keempat kolom saya perbaiki, tombolnya aktif lagi, dan ketika diklik muncul pesan terima kasih serta form kosong kembali.</w:t>
+            </w:r>
           </w:p>
         </w:tc>
       </w:tr>
@@ -11370,6 +11388,10 @@
             <w:pPr>
               <w:spacing w:before="20" w:after="20" w:line="252" w:lineRule="auto"/>
             </w:pPr>
+            <w:r>
+              <w:lastRenderedPageBreak/>
+              <w:t>Halaman diam; Console merah Elemen #daftarr tidak ditemukan</w:t>
+            </w:r>
           </w:p>
         </w:tc>
         <w:tc>
@@ -11386,6 +11408,9 @@
             <w:pPr>
               <w:spacing w:before="20" w:after="20" w:line="252" w:lineRule="auto"/>
             </w:pPr>
+            <w:r>
+              <w:t>id di JS berbeda satu huruf dari id di HTML, sehingga pemilih menghasilkan null</w:t>
+            </w:r>
           </w:p>
         </w:tc>
         <w:tc>
@@ -11402,6 +11427,26 @@
             <w:pPr>
               <w:spacing w:before="20" w:after="20" w:line="252" w:lineRule="auto"/>
             </w:pPr>
+            <w:r>
+              <w:t xml:space="preserve">dom.js </w:t>
+            </w:r>
+            <w:r>
+              <w:rPr>
+                <w:b/>
+                <w:bCs/>
+              </w:rPr>
+              <w:t>baris 1</w:t>
+            </w:r>
+            <w:r>
+              <w:rPr>
+                <w:b/>
+                <w:bCs/>
+              </w:rPr>
+              <w:t>1</w:t>
+            </w:r>
+            <w:r>
+              <w:t>: const wadah = wajib("#daftarr") saya kembalikan menjadi wajib("#daftar").</w:t>
+            </w:r>
           </w:p>
         </w:tc>
       </w:tr>
@@ -11425,6 +11470,9 @@
             <w:pPr>
               <w:spacing w:before="20" w:after="20" w:line="252" w:lineRule="auto"/>
             </w:pPr>
+            <w:r>
+              <w:t>Satu klik mencetak 1, 2, 3 baris dan seterusnya; panel Event Listeners menunjukkan banyak entri click</w:t>
+            </w:r>
           </w:p>
         </w:tc>
         <w:tc>
@@ -11441,6 +11489,9 @@
             <w:pPr>
               <w:spacing w:before="20" w:after="20" w:line="252" w:lineRule="auto"/>
             </w:pPr>
+            <w:r>
+              <w:t>addEventListener berada di dalam render, sehingga tiap render menambah pendengar baru</w:t>
+            </w:r>
           </w:p>
         </w:tc>
         <w:tc>
@@ -11457,6 +11508,29 @@
             <w:pPr>
               <w:spacing w:before="20" w:after="20" w:line="252" w:lineRule="auto"/>
             </w:pPr>
+            <w:r>
+              <w:t xml:space="preserve">om.js </w:t>
+            </w:r>
+            <w:r>
+              <w:rPr>
+                <w:b/>
+                <w:bCs/>
+              </w:rPr>
+              <w:t>baris 36</w:t>
+            </w:r>
+            <w:r>
+              <w:t xml:space="preserve"> (baris eksperimen yang saya sisipkan tepat di bawah function render di baris 35, sehingga baris wadah.textContent bergeser ke 37): saya hapus. Pendengar asli tetap di </w:t>
+            </w:r>
+            <w:r>
+              <w:rPr>
+                <w:b/>
+                <w:bCs/>
+              </w:rPr>
+              <w:t>baris 57</w:t>
+            </w:r>
+            <w:r>
+              <w:t>, di luar render.</w:t>
+            </w:r>
           </w:p>
         </w:tc>
       </w:tr>
@@ -11480,6 +11554,9 @@
             <w:pPr>
               <w:spacing w:before="20" w:after="20" w:line="252" w:lineRule="auto"/>
             </w:pPr>
+            <w:r>
+              <w:t>Klik Data membuat daftar kosong tanpa penjelasan</w:t>
+            </w:r>
           </w:p>
         </w:tc>
         <w:tc>
@@ -11496,6 +11573,9 @@
             <w:pPr>
               <w:spacing w:before="20" w:after="20" w:line="252" w:lineRule="auto"/>
             </w:pPr>
+            <w:r>
+              <w:t>penanganan keadaan kosong (daftar.length === 0) dinonaktifkan</w:t>
+            </w:r>
           </w:p>
         </w:tc>
         <w:tc>
@@ -11512,6 +11592,19 @@
             <w:pPr>
               <w:spacing w:before="20" w:after="20" w:line="252" w:lineRule="auto"/>
             </w:pPr>
+            <w:r>
+              <w:t xml:space="preserve">dom.js </w:t>
+            </w:r>
+            <w:r>
+              <w:rPr>
+                <w:b/>
+                <w:bCs/>
+              </w:rPr>
+              <w:t>baris 38 sampai 41</w:t>
+            </w:r>
+            <w:r>
+              <w:t>: tanda komentar // pada blok if (daftar.length === 0) { ... } saya hapus.</w:t>
+            </w:r>
           </w:p>
         </w:tc>
       </w:tr>
@@ -11967,7 +12060,19 @@
               <w:right w:val="single" w:sz="4" w:space="0" w:color="B9C6E2"/>
             </w:tcBorders>
           </w:tcPr>
-          <w:p/>
+          <w:p>
+            <w:r>
+              <w:t>Elemen: daftar proyek</w:t>
+            </w:r>
+            <w:r>
+              <w:br/>
+              <w:t>Pemilih: document.querySelector("#daftar")</w:t>
+            </w:r>
+            <w:r>
+              <w:br/>
+              <w:t>Nama variabel: wadah</w:t>
+            </w:r>
+          </w:p>
         </w:tc>
       </w:tr>
       <w:tr>
@@ -12029,7 +12134,23 @@
               <w:right w:val="single" w:sz="4" w:space="0" w:color="B9C6E2"/>
             </w:tcBorders>
           </w:tcPr>
-          <w:p/>
+          <w:p>
+            <w:r>
+              <w:t>querySelector mengembalikan satu elemen pertama (atau null)</w:t>
+            </w:r>
+            <w:r>
+              <w:t xml:space="preserve"> sedangkan </w:t>
+            </w:r>
+            <w:r>
+              <w:t>querySelectorAll mengembalikan semua yang cocok sebagai NodeList. NodeList bukan array, jadi tidak punya map/filter</w:t>
+            </w:r>
+            <w:r>
+              <w:t xml:space="preserve"> </w:t>
+            </w:r>
+            <w:r>
+              <w:t>ubah dulu dengan Array.from(...).</w:t>
+            </w:r>
+          </w:p>
         </w:tc>
       </w:tr>
       <w:tr>
@@ -12091,7 +12212,21 @@
               <w:right w:val="single" w:sz="4" w:space="0" w:color="B9C6E2"/>
             </w:tcBorders>
           </w:tcPr>
-          <w:p/>
+          <w:p>
+            <w:r>
+              <w:t xml:space="preserve">Keuntungannya adalah cukup menggunakan </w:t>
+            </w:r>
+            <w:r>
+              <w:rPr>
+                <w:b/>
+                <w:bCs/>
+              </w:rPr>
+              <w:t>satu event listener</w:t>
+            </w:r>
+            <w:r>
+              <w:t xml:space="preserve"> untuk menangani semua tombol filter. Cara ini lebih sederhana dan tombol yang berada di dalam induk tetap dapat ditangani meskipun ada elemen yang dibuat kemudian.</w:t>
+            </w:r>
+          </w:p>
         </w:tc>
       </w:tr>
       <w:tr>
@@ -12108,7 +12243,29 @@
               <w:right w:val="single" w:sz="4" w:space="0" w:color="B9C6E2"/>
             </w:tcBorders>
           </w:tcPr>
-          <w:p/>
+          <w:p>
+            <w:r>
+              <w:t xml:space="preserve">Pada bagian </w:t>
+            </w:r>
+            <w:r>
+              <w:t xml:space="preserve">const barisFilter = document.querySelector("#filter"); </w:t>
+            </w:r>
+          </w:p>
+          <w:p>
+            <w:r>
+              <w:t xml:space="preserve">barisFilter.addEventListener("click", (event) =&gt; { const tombol = event.target.closest("button"); </w:t>
+            </w:r>
+          </w:p>
+          <w:p>
+            <w:r>
+              <w:t>if (!tombol) return;</w:t>
+            </w:r>
+          </w:p>
+          <w:p>
+            <w:r>
+              <w:t>});</w:t>
+            </w:r>
+          </w:p>
         </w:tc>
       </w:tr>
     </w:tbl>
@@ -12153,7 +12310,11 @@
               <w:right w:val="single" w:sz="4" w:space="0" w:color="B9C6E2"/>
             </w:tcBorders>
           </w:tcPr>
-          <w:p/>
+          <w:p>
+            <w:r>
+              <w:t>Jika baris wadah.textContent = ""; dihapus, isi daftar lama tidak dihapus ketika render() dipanggil kembali. Akibatnya, setiap kali filter diklik, kartu proyek baru ditambahkan ke kartu sebelumnya sehingga jumlah kartu menjadi berlipat atau bertambah terus.</w:t>
+            </w:r>
+          </w:p>
         </w:tc>
       </w:tr>
       <w:tr>
@@ -12215,6 +12376,32 @@
               <w:right w:val="single" w:sz="4" w:space="0" w:color="B9C6E2"/>
             </w:tcBorders>
           </w:tcPr>
+          <w:p>
+            <w:pPr>
+              <w:rPr>
+                <w:lang w:val="id-ID"/>
+              </w:rPr>
+            </w:pPr>
+            <w:r>
+              <w:rPr>
+                <w:lang w:val="id-ID"/>
+              </w:rPr>
+              <w:t>Isi dari pengguna tidak boleh dimasukkan dengan innerHTML karena browser akan membaca isi tersebut sebagai HTML. Hal ini dapat menyebabkan isi yang tidak aman dijalankan sebagai HTML atau menimbulkan risiko XSS.</w:t>
+            </w:r>
+          </w:p>
+          <w:p>
+            <w:pPr>
+              <w:rPr>
+                <w:lang w:val="id-ID"/>
+              </w:rPr>
+            </w:pPr>
+            <w:r>
+              <w:rPr>
+                <w:lang w:val="id-ID"/>
+              </w:rPr>
+              <w:t>Sebagai gantinya, saya menggunakan textContent agar isi pengguna diperlakukan sebagai teks biasa.</w:t>
+            </w:r>
+          </w:p>
           <w:p/>
         </w:tc>
       </w:tr>
@@ -12294,7 +12481,7 @@
                 <w:color w:val="003796"/>
                 <w:sz w:val="22"/>
               </w:rPr>
-              <w:t>☐  Berkas  profil.html, seluruh CSS, js/app.js, dan js/dom.js ada di repositori dan terbuka tanpa galat di Console</w:t>
+              <w:t>V   Berkas  profil.html, seluruh CSS, js/app.js, dan js/dom.js ada di repositori dan terbuka tanpa galat di Console</w:t>
             </w:r>
           </w:p>
         </w:tc>
@@ -12320,7 +12507,7 @@
                 <w:color w:val="003796"/>
                 <w:sz w:val="22"/>
               </w:rPr>
-              <w:t>☐  Pemilih  setiap pemilih menghasilkan elemen; tidak ada satu pun yang bernilai null</w:t>
+              <w:t>V   Pemilih  setiap pemilih menghasilkan elemen; tidak ada satu pun yang bernilai null</w:t>
             </w:r>
           </w:p>
         </w:tc>
@@ -12346,7 +12533,7 @@
                 <w:color w:val="003796"/>
                 <w:sz w:val="22"/>
               </w:rPr>
-              <w:t>☐  Render dari data  daftar proyek terbentuk dari array dengan createElement dan textContent, bukan dari HTML yang ditulis tangan</w:t>
+              <w:t>V   Render dari data  daftar proyek terbentuk dari array dengan createElement dan textContent, bukan dari HTML yang ditulis tangan</w:t>
             </w:r>
           </w:p>
         </w:tc>
@@ -12372,7 +12559,7 @@
                 <w:color w:val="003796"/>
                 <w:sz w:val="22"/>
               </w:rPr>
-              <w:t>☐  Wadah  dikosongkan di baris pertama fungsi render, sehingga kartu tidak pernah berlipat</w:t>
+              <w:t>V   Wadah  dikosongkan di baris pertama fungsi render, sehingga kartu tidak pernah berlipat</w:t>
             </w:r>
           </w:p>
         </w:tc>
@@ -12398,7 +12585,7 @@
                 <w:color w:val="003796"/>
                 <w:sz w:val="22"/>
               </w:rPr>
-              <w:t>☐  Event delegation  satu pendengar di induk melayani semua tombol filter; event.target dan closest dipakai benar</w:t>
+              <w:t>V   Event delegation  satu pendengar di induk melayani semua tombol filter; event.target dan closest dipakai benar</w:t>
             </w:r>
           </w:p>
         </w:tc>
@@ -12424,7 +12611,7 @@
                 <w:color w:val="003796"/>
                 <w:sz w:val="22"/>
               </w:rPr>
-              <w:t>☐  Keadaan kosong  halaman menampilkan pesan ketika penyaringan tidak menghasilkan isi</w:t>
+              <w:t>V   Keadaan kosong  halaman menampilkan pesan ketika penyaringan tidak menghasilkan isi</w:t>
             </w:r>
           </w:p>
         </w:tc>
@@ -12450,8 +12637,23 @@
                 <w:color w:val="003796"/>
                 <w:sz w:val="22"/>
               </w:rPr>
-              <w:lastRenderedPageBreak/>
-              <w:t>☐  Validasi form  halaman tidak dimuat ulang, pesan galat muncul per kolom, dan tombol kirim menunggu sampai isinya layak</w:t>
+              <w:t xml:space="preserve"> </w:t>
+            </w:r>
+            <w:r>
+              <w:rPr>
+                <w:rFonts w:cs="Carlito"/>
+                <w:color w:val="003796"/>
+                <w:sz w:val="22"/>
+              </w:rPr>
+              <w:t xml:space="preserve">V </w:t>
+            </w:r>
+            <w:r>
+              <w:rPr>
+                <w:rFonts w:cs="Carlito"/>
+                <w:color w:val="003796"/>
+                <w:sz w:val="22"/>
+              </w:rPr>
+              <w:t>Validasi form  halaman tidak dimuat ulang, pesan galat muncul per kolom, dan tombol kirim menunggu sampai isinya layak</w:t>
             </w:r>
           </w:p>
         </w:tc>
@@ -12477,7 +12679,7 @@
                 <w:color w:val="003796"/>
                 <w:sz w:val="22"/>
               </w:rPr>
-              <w:t>☐  Deklarasi AI  bagian README menyebutkan bagian mana yang dibantu AI dan bagian mana yang Anda kerjakan sendiri</w:t>
+              <w:t>V  Deklarasi AI  bagian README menyebutkan bagian mana yang dibantu AI dan bagian mana yang Anda kerjakan sendiri</w:t>
             </w:r>
           </w:p>
         </w:tc>
@@ -12503,7 +12705,7 @@
                 <w:color w:val="003796"/>
                 <w:sz w:val="22"/>
               </w:rPr>
-              <w:t>☐  Git  ada lebih dari satu commit hari ini, dan pesan commit-nya menjelaskan isinya</w:t>
+              <w:t>V   Git  ada lebih dari satu commit hari ini, dan pesan commit-nya menjelaskan isinya</w:t>
             </w:r>
           </w:p>
         </w:tc>
@@ -12560,7 +12762,11 @@
               <w:right w:val="single" w:sz="4" w:space="0" w:color="B9C6E2"/>
             </w:tcBorders>
           </w:tcPr>
-          <w:p/>
+          <w:p>
+            <w:r>
+              <w:t>Saya harus memastikan elemen sudah ada dan wadah dikosongkan sebelum melakukan render agar tidak terjadi null dan kartu berlipat.</w:t>
+            </w:r>
+          </w:p>
         </w:tc>
       </w:tr>
       <w:tr>
@@ -12639,7 +12845,7 @@
                 <w:color w:val="003796"/>
                 <w:sz w:val="22"/>
               </w:rPr>
-              <w:t>☐  Pengungkapan AI  README menyebutkan bagian mana yang dibantu AI dan bagian mana yang saya kerjakan sendiri</w:t>
+              <w:t>V   Pengungkapan AI  README menyebutkan bagian mana yang dibantu AI dan bagian mana yang saya kerjakan sendiri</w:t>
             </w:r>
           </w:p>
         </w:tc>
@@ -12665,7 +12871,7 @@
                 <w:color w:val="003796"/>
                 <w:sz w:val="22"/>
               </w:rPr>
-              <w:t>☐  Keaslian  topik dan isi halaman ini milik saya sendiri, tidak menyalin pekerjaan mahasiswa lain</w:t>
+              <w:t>V   Keaslian  topik dan isi halaman ini milik saya sendiri, tidak menyalin pekerjaan mahasiswa lain</w:t>
             </w:r>
           </w:p>
         </w:tc>
@@ -12866,6 +13072,9 @@
             <w:pPr>
               <w:spacing w:before="20" w:after="20" w:line="252" w:lineRule="auto"/>
             </w:pPr>
+            <w:r>
+              <w:t>20</w:t>
+            </w:r>
           </w:p>
         </w:tc>
         <w:tc>
@@ -12951,6 +13160,9 @@
             <w:pPr>
               <w:spacing w:before="20" w:after="20" w:line="252" w:lineRule="auto"/>
             </w:pPr>
+            <w:r>
+              <w:t>25</w:t>
+            </w:r>
           </w:p>
         </w:tc>
         <w:tc>
@@ -13036,6 +13248,9 @@
             <w:pPr>
               <w:spacing w:before="20" w:after="20" w:line="252" w:lineRule="auto"/>
             </w:pPr>
+            <w:r>
+              <w:t>23</w:t>
+            </w:r>
           </w:p>
         </w:tc>
         <w:tc>
@@ -13121,6 +13336,9 @@
             <w:pPr>
               <w:spacing w:before="20" w:after="20" w:line="252" w:lineRule="auto"/>
             </w:pPr>
+            <w:r>
+              <w:t>15</w:t>
+            </w:r>
           </w:p>
         </w:tc>
         <w:tc>
@@ -13206,6 +13424,9 @@
             <w:pPr>
               <w:spacing w:before="20" w:after="20" w:line="252" w:lineRule="auto"/>
             </w:pPr>
+            <w:r>
+              <w:t>7</w:t>
+            </w:r>
           </w:p>
         </w:tc>
         <w:tc>
@@ -13291,6 +13512,9 @@
             <w:pPr>
               <w:spacing w:before="20" w:after="20" w:line="252" w:lineRule="auto"/>
             </w:pPr>
+            <w:r>
+              <w:t>91</w:t>
+            </w:r>
           </w:p>
         </w:tc>
         <w:tc>
@@ -13362,7 +13586,12 @@
               <w:right w:val="single" w:sz="4" w:space="0" w:color="B9C6E2"/>
             </w:tcBorders>
           </w:tcPr>
-          <w:p/>
+          <w:p>
+            <w:r>
+              <w:lastRenderedPageBreak/>
+              <w:t>Bagian tersulit adalah memahami event delegation dan memastikan fungsi render mengosongkan daftar sebelum menampilkan data baru.</w:t>
+            </w:r>
+          </w:p>
         </w:tc>
       </w:tr>
       <w:tr>
@@ -13452,7 +13681,21 @@
           <w:rFonts w:cs="Carlito"/>
           <w:sz w:val="20"/>
         </w:rPr>
-        <w:t>Tanda tangan: ______________________________     Tanggal: ______________     Jam selesai: __________</w:t>
+        <w:t xml:space="preserve">Tanda tangan: ______________________________     Tanggal: </w:t>
+      </w:r>
+      <w:r>
+        <w:rPr>
+          <w:rFonts w:cs="Carlito"/>
+          <w:sz w:val="20"/>
+        </w:rPr>
+        <w:t>07/10.2026</w:t>
+      </w:r>
+      <w:r>
+        <w:rPr>
+          <w:rFonts w:cs="Carlito"/>
+          <w:sz w:val="20"/>
+        </w:rPr>
+        <w:t xml:space="preserve">    Jam selesai: __________</w:t>
       </w:r>
     </w:p>
     <w:p>
@@ -13539,7 +13782,6 @@
                 <w:color w:val="E2E8F0"/>
                 <w:sz w:val="17"/>
               </w:rPr>
-              <w:lastRenderedPageBreak/>
               <w:t>git add .</w:t>
             </w:r>
             <w:r>

</xml_diff>